<commit_message>
Ship FYP reports, viva pack, CSV import UX, and Supabase-ready pooling.
Co-authored-by: Cursor <cursoragent@cursor.com>
</commit_message>
<xml_diff>
--- a/docs/scenarios/Tranz-Algo_Demo_Shipment_Data.docx
+++ b/docs/scenarios/Tranz-Algo_Demo_Shipment_Data.docx
@@ -13,7 +13,7 @@
     </w:p>
     <w:p>
       <w:r>
-        <w:t>Made-up sample batches for entering into the Tranz-Algo app. Create products first under Products, then each shipment under Shipments. Use True Cost to allocate, price, and commit.</w:t>
+        <w:t>Two short demos. Import products CSV, then each full shipment CSV, then True Cost. A = Already-Local (ZMW paperwork). B = Auto FX (Fetch FX or rate 27.50).</w:t>
       </w:r>
     </w:p>
     <w:p>
@@ -21,12 +21,12 @@
         <w:pStyle w:val="Heading1"/>
       </w:pPr>
       <w:r>
-        <w:t>Shipment 1 — Already-Local (agent paperwork in ZMW)</w:t>
+        <w:t>Demo A — Already-Local (groceries)</w:t>
       </w:r>
     </w:p>
     <w:p>
       <w:r>
-        <w:t>Story: Soaps arrived from Johannesburg. Your clearing agent sent one ZMW invoice — no foreign currency on the supplier side.</w:t>
+        <w:t>Road goods from SA. Agent paperwork already in ZMW. Show allocate → landed → suggest → commit.</w:t>
       </w:r>
     </w:p>
     <w:p>
@@ -34,7 +34,7 @@
         <w:pStyle w:val="Heading2"/>
       </w:pPr>
       <w:r>
-        <w:t>Products (create once)</w:t>
+        <w:t>Products</w:t>
       </w:r>
     </w:p>
     <w:tbl>
@@ -96,7 +96,7 @@
           </w:tcPr>
           <w:p>
             <w:r>
-              <w:t>SOAP-LAV</w:t>
+              <w:t>RICE-5</w:t>
             </w:r>
           </w:p>
         </w:tc>
@@ -106,7 +106,7 @@
           </w:tcPr>
           <w:p>
             <w:r>
-              <w:t>Lavender bath soap</w:t>
+              <w:t>Rice 5 kg</w:t>
             </w:r>
           </w:p>
         </w:tc>
@@ -116,7 +116,7 @@
           </w:tcPr>
           <w:p>
             <w:r>
-              <w:t>0.15</w:t>
+              <w:t>5</w:t>
             </w:r>
           </w:p>
         </w:tc>
@@ -128,7 +128,7 @@
           </w:tcPr>
           <w:p>
             <w:r>
-              <w:t>SOAP-ALO</w:t>
+              <w:t>SUGAR-1</w:t>
             </w:r>
           </w:p>
         </w:tc>
@@ -138,7 +138,7 @@
           </w:tcPr>
           <w:p>
             <w:r>
-              <w:t>Aloe vera soap</w:t>
+              <w:t>Sugar 1 kg</w:t>
             </w:r>
           </w:p>
         </w:tc>
@@ -148,7 +148,7 @@
           </w:tcPr>
           <w:p>
             <w:r>
-              <w:t>0.15</w:t>
+              <w:t>1</w:t>
             </w:r>
           </w:p>
         </w:tc>
@@ -160,7 +160,7 @@
           </w:tcPr>
           <w:p>
             <w:r>
-              <w:t>SOAP-CIT</w:t>
+              <w:t>OIL-2L</w:t>
             </w:r>
           </w:p>
         </w:tc>
@@ -170,7 +170,71 @@
           </w:tcPr>
           <w:p>
             <w:r>
-              <w:t>Citrus hand soap</w:t>
+              <w:t>Cooking oil 2 L</w:t>
+            </w:r>
+          </w:p>
+        </w:tc>
+        <w:tc>
+          <w:tcPr>
+            <w:tcW w:type="dxa" w:w="2880"/>
+          </w:tcPr>
+          <w:p>
+            <w:r>
+              <w:t>2</w:t>
+            </w:r>
+          </w:p>
+        </w:tc>
+      </w:tr>
+      <w:tr>
+        <w:tc>
+          <w:tcPr>
+            <w:tcW w:type="dxa" w:w="2880"/>
+          </w:tcPr>
+          <w:p>
+            <w:r>
+              <w:t>TEA-500</w:t>
+            </w:r>
+          </w:p>
+        </w:tc>
+        <w:tc>
+          <w:tcPr>
+            <w:tcW w:type="dxa" w:w="2880"/>
+          </w:tcPr>
+          <w:p>
+            <w:r>
+              <w:t>Black tea 500 g</w:t>
+            </w:r>
+          </w:p>
+        </w:tc>
+        <w:tc>
+          <w:tcPr>
+            <w:tcW w:type="dxa" w:w="2880"/>
+          </w:tcPr>
+          <w:p>
+            <w:r>
+              <w:t>0.5</w:t>
+            </w:r>
+          </w:p>
+        </w:tc>
+      </w:tr>
+      <w:tr>
+        <w:tc>
+          <w:tcPr>
+            <w:tcW w:type="dxa" w:w="2880"/>
+          </w:tcPr>
+          <w:p>
+            <w:r>
+              <w:t>SOAP-BAR</w:t>
+            </w:r>
+          </w:p>
+        </w:tc>
+        <w:tc>
+          <w:tcPr>
+            <w:tcW w:type="dxa" w:w="2880"/>
+          </w:tcPr>
+          <w:p>
+            <w:r>
+              <w:t>Bath soap bar</w:t>
             </w:r>
           </w:p>
         </w:tc>
@@ -192,7 +256,7 @@
         <w:pStyle w:val="Heading2"/>
       </w:pPr>
       <w:r>
-        <w:t>New shipment header</w:t>
+        <w:t>Shipment</w:t>
       </w:r>
     </w:p>
     <w:tbl>
@@ -250,7 +314,7 @@
           </w:tcPr>
           <w:p>
             <w:r>
-              <w:t>SHP-LOC-2026-01</w:t>
+              <w:t>SHP-DEMO-LOCAL-ZMW</w:t>
             </w:r>
           </w:p>
         </w:tc>
@@ -272,7 +336,7 @@
           </w:tcPr>
           <w:p>
             <w:r>
-              <w:t>Cape Clean Supplies</w:t>
+              <w:t>SA Wholesale (Johannesburg)</w:t>
             </w:r>
           </w:p>
         </w:tc>
@@ -284,7 +348,7 @@
           </w:tcPr>
           <w:p>
             <w:r>
-              <w:t>Invoice #</w:t>
+              <w:t>Mode</w:t>
             </w:r>
           </w:p>
         </w:tc>
@@ -294,117 +358,7 @@
           </w:tcPr>
           <w:p>
             <w:r>
-              <w:t>CA-8842</w:t>
-            </w:r>
-          </w:p>
-        </w:tc>
-      </w:tr>
-      <w:tr>
-        <w:tc>
-          <w:tcPr>
-            <w:tcW w:type="dxa" w:w="4320"/>
-          </w:tcPr>
-          <w:p>
-            <w:r>
-              <w:t>Clearing agent</w:t>
-            </w:r>
-          </w:p>
-        </w:tc>
-        <w:tc>
-          <w:tcPr>
-            <w:tcW w:type="dxa" w:w="4320"/>
-          </w:tcPr>
-          <w:p>
-            <w:r>
-              <w:t>Mwamba Logistics</w:t>
-            </w:r>
-          </w:p>
-        </w:tc>
-      </w:tr>
-      <w:tr>
-        <w:tc>
-          <w:tcPr>
-            <w:tcW w:type="dxa" w:w="4320"/>
-          </w:tcPr>
-          <w:p>
-            <w:r>
-              <w:t>Carrier</w:t>
-            </w:r>
-          </w:p>
-        </w:tc>
-        <w:tc>
-          <w:tcPr>
-            <w:tcW w:type="dxa" w:w="4320"/>
-          </w:tcPr>
-          <w:p>
-            <w:r>
-              <w:t>Intercity Freight</w:t>
-            </w:r>
-          </w:p>
-        </w:tc>
-      </w:tr>
-      <w:tr>
-        <w:tc>
-          <w:tcPr>
-            <w:tcW w:type="dxa" w:w="4320"/>
-          </w:tcPr>
-          <w:p>
-            <w:r>
-              <w:t>Origin</w:t>
-            </w:r>
-          </w:p>
-        </w:tc>
-        <w:tc>
-          <w:tcPr>
-            <w:tcW w:type="dxa" w:w="4320"/>
-          </w:tcPr>
-          <w:p>
-            <w:r>
-              <w:t>South Africa</w:t>
-            </w:r>
-          </w:p>
-        </w:tc>
-      </w:tr>
-      <w:tr>
-        <w:tc>
-          <w:tcPr>
-            <w:tcW w:type="dxa" w:w="4320"/>
-          </w:tcPr>
-          <w:p>
-            <w:r>
-              <w:t>Primary cost mode</w:t>
-            </w:r>
-          </w:p>
-        </w:tc>
-        <w:tc>
-          <w:tcPr>
-            <w:tcW w:type="dxa" w:w="4320"/>
-          </w:tcPr>
-          <w:p>
-            <w:r>
-              <w:t>Already-Local</w:t>
-            </w:r>
-          </w:p>
-        </w:tc>
-      </w:tr>
-      <w:tr>
-        <w:tc>
-          <w:tcPr>
-            <w:tcW w:type="dxa" w:w="4320"/>
-          </w:tcPr>
-          <w:p>
-            <w:r>
-              <w:t>Local currency</w:t>
-            </w:r>
-          </w:p>
-        </w:tc>
-        <w:tc>
-          <w:tcPr>
-            <w:tcW w:type="dxa" w:w="4320"/>
-          </w:tcPr>
-          <w:p>
-            <w:r>
-              <w:t>ZMW</w:t>
+              <w:t>Already-Local (set on create)</w:t>
             </w:r>
           </w:p>
         </w:tc>
@@ -416,7 +370,7 @@
         <w:pStyle w:val="Heading2"/>
       </w:pPr>
       <w:r>
-        <w:t>Lines (mode: Already-Local on each line)</w:t>
+        <w:t>Lines</w:t>
       </w:r>
     </w:p>
     <w:tbl>
@@ -478,7 +432,103 @@
           </w:tcPr>
           <w:p>
             <w:r>
-              <w:t>SOAP-LAV</w:t>
+              <w:t>RICE-5</w:t>
+            </w:r>
+          </w:p>
+        </w:tc>
+        <w:tc>
+          <w:tcPr>
+            <w:tcW w:type="dxa" w:w="2880"/>
+          </w:tcPr>
+          <w:p>
+            <w:r>
+              <w:t>20</w:t>
+            </w:r>
+          </w:p>
+        </w:tc>
+        <w:tc>
+          <w:tcPr>
+            <w:tcW w:type="dxa" w:w="2880"/>
+          </w:tcPr>
+          <w:p>
+            <w:r>
+              <w:t>95</w:t>
+            </w:r>
+          </w:p>
+        </w:tc>
+      </w:tr>
+      <w:tr>
+        <w:tc>
+          <w:tcPr>
+            <w:tcW w:type="dxa" w:w="2880"/>
+          </w:tcPr>
+          <w:p>
+            <w:r>
+              <w:t>SUGAR-1</w:t>
+            </w:r>
+          </w:p>
+        </w:tc>
+        <w:tc>
+          <w:tcPr>
+            <w:tcW w:type="dxa" w:w="2880"/>
+          </w:tcPr>
+          <w:p>
+            <w:r>
+              <w:t>30</w:t>
+            </w:r>
+          </w:p>
+        </w:tc>
+        <w:tc>
+          <w:tcPr>
+            <w:tcW w:type="dxa" w:w="2880"/>
+          </w:tcPr>
+          <w:p>
+            <w:r>
+              <w:t>32</w:t>
+            </w:r>
+          </w:p>
+        </w:tc>
+      </w:tr>
+      <w:tr>
+        <w:tc>
+          <w:tcPr>
+            <w:tcW w:type="dxa" w:w="2880"/>
+          </w:tcPr>
+          <w:p>
+            <w:r>
+              <w:t>OIL-2L</w:t>
+            </w:r>
+          </w:p>
+        </w:tc>
+        <w:tc>
+          <w:tcPr>
+            <w:tcW w:type="dxa" w:w="2880"/>
+          </w:tcPr>
+          <w:p>
+            <w:r>
+              <w:t>10</w:t>
+            </w:r>
+          </w:p>
+        </w:tc>
+        <w:tc>
+          <w:tcPr>
+            <w:tcW w:type="dxa" w:w="2880"/>
+          </w:tcPr>
+          <w:p>
+            <w:r>
+              <w:t>85</w:t>
+            </w:r>
+          </w:p>
+        </w:tc>
+      </w:tr>
+      <w:tr>
+        <w:tc>
+          <w:tcPr>
+            <w:tcW w:type="dxa" w:w="2880"/>
+          </w:tcPr>
+          <w:p>
+            <w:r>
+              <w:t>TEA-500</w:t>
             </w:r>
           </w:p>
         </w:tc>
@@ -498,7 +548,7 @@
           </w:tcPr>
           <w:p>
             <w:r>
-              <w:t>18.50</w:t>
+              <w:t>45</w:t>
             </w:r>
           </w:p>
         </w:tc>
@@ -510,7 +560,7 @@
           </w:tcPr>
           <w:p>
             <w:r>
-              <w:t>SOAP-ALO</w:t>
+              <w:t>SOAP-BAR</w:t>
             </w:r>
           </w:p>
         </w:tc>
@@ -520,7 +570,7 @@
           </w:tcPr>
           <w:p>
             <w:r>
-              <w:t>24</w:t>
+              <w:t>16</w:t>
             </w:r>
           </w:p>
         </w:tc>
@@ -530,39 +580,7 @@
           </w:tcPr>
           <w:p>
             <w:r>
-              <w:t>22.00</w:t>
-            </w:r>
-          </w:p>
-        </w:tc>
-      </w:tr>
-      <w:tr>
-        <w:tc>
-          <w:tcPr>
-            <w:tcW w:type="dxa" w:w="2880"/>
-          </w:tcPr>
-          <w:p>
-            <w:r>
-              <w:t>SOAP-CIT</w:t>
-            </w:r>
-          </w:p>
-        </w:tc>
-        <w:tc>
-          <w:tcPr>
-            <w:tcW w:type="dxa" w:w="2880"/>
-          </w:tcPr>
-          <w:p>
-            <w:r>
-              <w:t>12</w:t>
-            </w:r>
-          </w:p>
-        </w:tc>
-        <w:tc>
-          <w:tcPr>
-            <w:tcW w:type="dxa" w:w="2880"/>
-          </w:tcPr>
-          <w:p>
-            <w:r>
-              <w:t>19.00</w:t>
+              <w:t>18</w:t>
             </w:r>
           </w:p>
         </w:tc>
@@ -574,7 +592,7 @@
         <w:pStyle w:val="Heading2"/>
       </w:pPr>
       <w:r>
-        <w:t>Save costs</w:t>
+        <w:t>Costs</w:t>
       </w:r>
     </w:p>
     <w:tbl>
@@ -622,7 +640,7 @@
           </w:tcPr>
           <w:p>
             <w:r>
-              <w:t>Shipping total</w:t>
+              <w:t>Shipping</w:t>
             </w:r>
           </w:p>
         </w:tc>
@@ -632,7 +650,7 @@
           </w:tcPr>
           <w:p>
             <w:r>
-              <w:t>4,500</w:t>
+              <w:t>5000</w:t>
             </w:r>
           </w:p>
         </w:tc>
@@ -644,7 +662,7 @@
           </w:tcPr>
           <w:p>
             <w:r>
-              <w:t>Duty total</w:t>
+              <w:t>Duty</w:t>
             </w:r>
           </w:p>
         </w:tc>
@@ -654,7 +672,7 @@
           </w:tcPr>
           <w:p>
             <w:r>
-              <w:t>1,100</w:t>
+              <w:t>1000</w:t>
             </w:r>
           </w:p>
         </w:tc>
@@ -666,7 +684,7 @@
           </w:tcPr>
           <w:p>
             <w:r>
-              <w:t>VAT total</w:t>
+              <w:t>VAT</w:t>
             </w:r>
           </w:p>
         </w:tc>
@@ -676,7 +694,7 @@
           </w:tcPr>
           <w:p>
             <w:r>
-              <w:t>1,650</w:t>
+              <w:t>1500</w:t>
             </w:r>
           </w:p>
         </w:tc>
@@ -688,7 +706,7 @@
           </w:tcPr>
           <w:p>
             <w:r>
-              <w:t>Paperwork source</w:t>
+              <w:t>Paperwork</w:t>
             </w:r>
           </w:p>
         </w:tc>
@@ -698,7 +716,7 @@
           </w:tcPr>
           <w:p>
             <w:r>
-              <w:t>Agent invoice MW-441 / FR-992</w:t>
+              <w:t>Agent invoice AG-100 / road pack RC-441</w:t>
             </w:r>
           </w:p>
         </w:tc>
@@ -768,7 +786,7 @@
           </w:tcPr>
           <w:p>
             <w:r>
-              <w:t>quantity</w:t>
+              <w:t>quantity (100 units)</w:t>
             </w:r>
           </w:p>
         </w:tc>
@@ -780,7 +798,7 @@
           </w:tcPr>
           <w:p>
             <w:r>
-              <w:t>Profit margin</w:t>
+              <w:t>Margin</w:t>
             </w:r>
           </w:p>
         </w:tc>
@@ -790,7 +808,74 @@
           </w:tcPr>
           <w:p>
             <w:r>
-              <w:t>0.30 (30%)</w:t>
+              <w:t>0.30</w:t>
+            </w:r>
+          </w:p>
+        </w:tc>
+      </w:tr>
+    </w:tbl>
+    <w:p/>
+    <w:p>
+      <w:pPr>
+        <w:pStyle w:val="Heading2"/>
+      </w:pPr>
+      <w:r>
+        <w:t>Expected (check)</w:t>
+      </w:r>
+    </w:p>
+    <w:p>
+      <w:r>
+        <w:t>Shares per unit: ship 50 + duty 10 + VAT 15 = 75</w:t>
+      </w:r>
+    </w:p>
+    <w:tbl>
+      <w:tblPr>
+        <w:tblStyle w:val="TableGrid"/>
+        <w:tblW w:type="auto" w:w="0"/>
+        <w:tblLook w:firstColumn="1" w:firstRow="1" w:lastColumn="0" w:lastRow="0" w:noHBand="0" w:noVBand="1" w:val="04A0"/>
+      </w:tblPr>
+      <w:tblGrid>
+        <w:gridCol w:w="2880"/>
+        <w:gridCol w:w="2880"/>
+        <w:gridCol w:w="2880"/>
+      </w:tblGrid>
+      <w:tr>
+        <w:tc>
+          <w:tcPr>
+            <w:tcW w:type="dxa" w:w="2880"/>
+          </w:tcPr>
+          <w:p>
+            <w:r>
+              <w:rPr>
+                <w:b/>
+              </w:rPr>
+              <w:t>SKU</w:t>
+            </w:r>
+          </w:p>
+        </w:tc>
+        <w:tc>
+          <w:tcPr>
+            <w:tcW w:type="dxa" w:w="2880"/>
+          </w:tcPr>
+          <w:p>
+            <w:r>
+              <w:rPr>
+                <w:b/>
+              </w:rPr>
+              <w:t>Landed unit</w:t>
+            </w:r>
+          </w:p>
+        </w:tc>
+        <w:tc>
+          <w:tcPr>
+            <w:tcW w:type="dxa" w:w="2880"/>
+          </w:tcPr>
+          <w:p>
+            <w:r>
+              <w:rPr>
+                <w:b/>
+              </w:rPr>
+              <w:t>Suggested ×1.30</w:t>
             </w:r>
           </w:p>
         </w:tc>
@@ -798,21 +883,159 @@
       <w:tr>
         <w:tc>
           <w:tcPr>
-            <w:tcW w:type="dxa" w:w="4320"/>
+            <w:tcW w:type="dxa" w:w="2880"/>
           </w:tcPr>
           <w:p>
             <w:r>
-              <w:t>Action</w:t>
+              <w:t>RICE-5</w:t>
             </w:r>
           </w:p>
         </w:tc>
         <w:tc>
           <w:tcPr>
-            <w:tcW w:type="dxa" w:w="4320"/>
+            <w:tcW w:type="dxa" w:w="2880"/>
           </w:tcPr>
           <w:p>
             <w:r>
-              <w:t>Commit batch when ready</w:t>
+              <w:t>170.00</w:t>
+            </w:r>
+          </w:p>
+        </w:tc>
+        <w:tc>
+          <w:tcPr>
+            <w:tcW w:type="dxa" w:w="2880"/>
+          </w:tcPr>
+          <w:p>
+            <w:r>
+              <w:t>221.00</w:t>
+            </w:r>
+          </w:p>
+        </w:tc>
+      </w:tr>
+      <w:tr>
+        <w:tc>
+          <w:tcPr>
+            <w:tcW w:type="dxa" w:w="2880"/>
+          </w:tcPr>
+          <w:p>
+            <w:r>
+              <w:t>SUGAR-1</w:t>
+            </w:r>
+          </w:p>
+        </w:tc>
+        <w:tc>
+          <w:tcPr>
+            <w:tcW w:type="dxa" w:w="2880"/>
+          </w:tcPr>
+          <w:p>
+            <w:r>
+              <w:t>107.00</w:t>
+            </w:r>
+          </w:p>
+        </w:tc>
+        <w:tc>
+          <w:tcPr>
+            <w:tcW w:type="dxa" w:w="2880"/>
+          </w:tcPr>
+          <w:p>
+            <w:r>
+              <w:t>139.10</w:t>
+            </w:r>
+          </w:p>
+        </w:tc>
+      </w:tr>
+      <w:tr>
+        <w:tc>
+          <w:tcPr>
+            <w:tcW w:type="dxa" w:w="2880"/>
+          </w:tcPr>
+          <w:p>
+            <w:r>
+              <w:t>OIL-2L</w:t>
+            </w:r>
+          </w:p>
+        </w:tc>
+        <w:tc>
+          <w:tcPr>
+            <w:tcW w:type="dxa" w:w="2880"/>
+          </w:tcPr>
+          <w:p>
+            <w:r>
+              <w:t>160.00</w:t>
+            </w:r>
+          </w:p>
+        </w:tc>
+        <w:tc>
+          <w:tcPr>
+            <w:tcW w:type="dxa" w:w="2880"/>
+          </w:tcPr>
+          <w:p>
+            <w:r>
+              <w:t>208.00</w:t>
+            </w:r>
+          </w:p>
+        </w:tc>
+      </w:tr>
+      <w:tr>
+        <w:tc>
+          <w:tcPr>
+            <w:tcW w:type="dxa" w:w="2880"/>
+          </w:tcPr>
+          <w:p>
+            <w:r>
+              <w:t>TEA-500</w:t>
+            </w:r>
+          </w:p>
+        </w:tc>
+        <w:tc>
+          <w:tcPr>
+            <w:tcW w:type="dxa" w:w="2880"/>
+          </w:tcPr>
+          <w:p>
+            <w:r>
+              <w:t>120.00</w:t>
+            </w:r>
+          </w:p>
+        </w:tc>
+        <w:tc>
+          <w:tcPr>
+            <w:tcW w:type="dxa" w:w="2880"/>
+          </w:tcPr>
+          <w:p>
+            <w:r>
+              <w:t>156.00</w:t>
+            </w:r>
+          </w:p>
+        </w:tc>
+      </w:tr>
+      <w:tr>
+        <w:tc>
+          <w:tcPr>
+            <w:tcW w:type="dxa" w:w="2880"/>
+          </w:tcPr>
+          <w:p>
+            <w:r>
+              <w:t>SOAP-BAR</w:t>
+            </w:r>
+          </w:p>
+        </w:tc>
+        <w:tc>
+          <w:tcPr>
+            <w:tcW w:type="dxa" w:w="2880"/>
+          </w:tcPr>
+          <w:p>
+            <w:r>
+              <w:t>93.00</w:t>
+            </w:r>
+          </w:p>
+        </w:tc>
+        <w:tc>
+          <w:tcPr>
+            <w:tcW w:type="dxa" w:w="2880"/>
+          </w:tcPr>
+          <w:p>
+            <w:r>
+              <w:t>120.90</w:t>
             </w:r>
           </w:p>
         </w:tc>
@@ -824,12 +1047,12 @@
         <w:pStyle w:val="Heading1"/>
       </w:pPr>
       <w:r>
-        <w:t>Shipment 2 — Auto FX (USD supplier invoice)</w:t>
+        <w:t>Demo B — Auto FX (phone parts)</w:t>
       </w:r>
     </w:p>
     <w:p>
       <w:r>
-        <w:t>Story: LED lighting from Shenzhen. Supplier invoice is in USD; freight and tax paperwork are already in ZMW.</w:t>
+        <w:t>USD invoice from China. Click Fetch FX, then allocate by weight → commit. If offline, keep rate 27.50.</w:t>
       </w:r>
     </w:p>
     <w:p>
@@ -837,7 +1060,7 @@
         <w:pStyle w:val="Heading2"/>
       </w:pPr>
       <w:r>
-        <w:t>Products (create once)</w:t>
+        <w:t>Products</w:t>
       </w:r>
     </w:p>
     <w:tbl>
@@ -899,7 +1122,7 @@
           </w:tcPr>
           <w:p>
             <w:r>
-              <w:t>LED-9W</w:t>
+              <w:t>EARBUD</w:t>
             </w:r>
           </w:p>
         </w:tc>
@@ -909,7 +1132,103 @@
           </w:tcPr>
           <w:p>
             <w:r>
-              <w:t>9W LED bulb warm white</w:t>
+              <w:t>Wireless earbuds</w:t>
+            </w:r>
+          </w:p>
+        </w:tc>
+        <w:tc>
+          <w:tcPr>
+            <w:tcW w:type="dxa" w:w="2880"/>
+          </w:tcPr>
+          <w:p>
+            <w:r>
+              <w:t>0.05</w:t>
+            </w:r>
+          </w:p>
+        </w:tc>
+      </w:tr>
+      <w:tr>
+        <w:tc>
+          <w:tcPr>
+            <w:tcW w:type="dxa" w:w="2880"/>
+          </w:tcPr>
+          <w:p>
+            <w:r>
+              <w:t>CHARGER</w:t>
+            </w:r>
+          </w:p>
+        </w:tc>
+        <w:tc>
+          <w:tcPr>
+            <w:tcW w:type="dxa" w:w="2880"/>
+          </w:tcPr>
+          <w:p>
+            <w:r>
+              <w:t>Phone charger</w:t>
+            </w:r>
+          </w:p>
+        </w:tc>
+        <w:tc>
+          <w:tcPr>
+            <w:tcW w:type="dxa" w:w="2880"/>
+          </w:tcPr>
+          <w:p>
+            <w:r>
+              <w:t>0.20</w:t>
+            </w:r>
+          </w:p>
+        </w:tc>
+      </w:tr>
+      <w:tr>
+        <w:tc>
+          <w:tcPr>
+            <w:tcW w:type="dxa" w:w="2880"/>
+          </w:tcPr>
+          <w:p>
+            <w:r>
+              <w:t>CABLE</w:t>
+            </w:r>
+          </w:p>
+        </w:tc>
+        <w:tc>
+          <w:tcPr>
+            <w:tcW w:type="dxa" w:w="2880"/>
+          </w:tcPr>
+          <w:p>
+            <w:r>
+              <w:t>USB-C cable</w:t>
+            </w:r>
+          </w:p>
+        </w:tc>
+        <w:tc>
+          <w:tcPr>
+            <w:tcW w:type="dxa" w:w="2880"/>
+          </w:tcPr>
+          <w:p>
+            <w:r>
+              <w:t>0.05</w:t>
+            </w:r>
+          </w:p>
+        </w:tc>
+      </w:tr>
+      <w:tr>
+        <w:tc>
+          <w:tcPr>
+            <w:tcW w:type="dxa" w:w="2880"/>
+          </w:tcPr>
+          <w:p>
+            <w:r>
+              <w:t>CASE-SOFT</w:t>
+            </w:r>
+          </w:p>
+        </w:tc>
+        <w:tc>
+          <w:tcPr>
+            <w:tcW w:type="dxa" w:w="2880"/>
+          </w:tcPr>
+          <w:p>
+            <w:r>
+              <w:t>Phone soft case</w:t>
             </w:r>
           </w:p>
         </w:tc>
@@ -924,70 +1243,6 @@
           </w:p>
         </w:tc>
       </w:tr>
-      <w:tr>
-        <w:tc>
-          <w:tcPr>
-            <w:tcW w:type="dxa" w:w="2880"/>
-          </w:tcPr>
-          <w:p>
-            <w:r>
-              <w:t>LED-12W</w:t>
-            </w:r>
-          </w:p>
-        </w:tc>
-        <w:tc>
-          <w:tcPr>
-            <w:tcW w:type="dxa" w:w="2880"/>
-          </w:tcPr>
-          <w:p>
-            <w:r>
-              <w:t>12W LED bulb daylight</w:t>
-            </w:r>
-          </w:p>
-        </w:tc>
-        <w:tc>
-          <w:tcPr>
-            <w:tcW w:type="dxa" w:w="2880"/>
-          </w:tcPr>
-          <w:p>
-            <w:r>
-              <w:t>0.10</w:t>
-            </w:r>
-          </w:p>
-        </w:tc>
-      </w:tr>
-      <w:tr>
-        <w:tc>
-          <w:tcPr>
-            <w:tcW w:type="dxa" w:w="2880"/>
-          </w:tcPr>
-          <w:p>
-            <w:r>
-              <w:t>LED-BATT</w:t>
-            </w:r>
-          </w:p>
-        </w:tc>
-        <w:tc>
-          <w:tcPr>
-            <w:tcW w:type="dxa" w:w="2880"/>
-          </w:tcPr>
-          <w:p>
-            <w:r>
-              <w:t>Rechargeable LED lantern</w:t>
-            </w:r>
-          </w:p>
-        </w:tc>
-        <w:tc>
-          <w:tcPr>
-            <w:tcW w:type="dxa" w:w="2880"/>
-          </w:tcPr>
-          <w:p>
-            <w:r>
-              <w:t>0.45</w:t>
-            </w:r>
-          </w:p>
-        </w:tc>
-      </w:tr>
     </w:tbl>
     <w:p/>
     <w:p>
@@ -995,7 +1250,7 @@
         <w:pStyle w:val="Heading2"/>
       </w:pPr>
       <w:r>
-        <w:t>New shipment header</w:t>
+        <w:t>Shipment</w:t>
       </w:r>
     </w:p>
     <w:tbl>
@@ -1053,7 +1308,7 @@
           </w:tcPr>
           <w:p>
             <w:r>
-              <w:t>SHP-FX-2026-02</w:t>
+              <w:t>SHP-DEMO-AUTO-FX</w:t>
             </w:r>
           </w:p>
         </w:tc>
@@ -1075,7 +1330,7 @@
           </w:tcPr>
           <w:p>
             <w:r>
-              <w:t>BrightPath Electronics Ltd</w:t>
+              <w:t>Shenzhen Parts Co</w:t>
             </w:r>
           </w:p>
         </w:tc>
@@ -1087,7 +1342,7 @@
           </w:tcPr>
           <w:p>
             <w:r>
-              <w:t>Invoice #</w:t>
+              <w:t>Mode</w:t>
             </w:r>
           </w:p>
         </w:tc>
@@ -1097,95 +1352,7 @@
           </w:tcPr>
           <w:p>
             <w:r>
-              <w:t>BP-SZ-11907</w:t>
-            </w:r>
-          </w:p>
-        </w:tc>
-      </w:tr>
-      <w:tr>
-        <w:tc>
-          <w:tcPr>
-            <w:tcW w:type="dxa" w:w="4320"/>
-          </w:tcPr>
-          <w:p>
-            <w:r>
-              <w:t>Clearing agent</w:t>
-            </w:r>
-          </w:p>
-        </w:tc>
-        <w:tc>
-          <w:tcPr>
-            <w:tcW w:type="dxa" w:w="4320"/>
-          </w:tcPr>
-          <w:p>
-            <w:r>
-              <w:t>Zed Customs Partners</w:t>
-            </w:r>
-          </w:p>
-        </w:tc>
-      </w:tr>
-      <w:tr>
-        <w:tc>
-          <w:tcPr>
-            <w:tcW w:type="dxa" w:w="4320"/>
-          </w:tcPr>
-          <w:p>
-            <w:r>
-              <w:t>Carrier</w:t>
-            </w:r>
-          </w:p>
-        </w:tc>
-        <w:tc>
-          <w:tcPr>
-            <w:tcW w:type="dxa" w:w="4320"/>
-          </w:tcPr>
-          <w:p>
-            <w:r>
-              <w:t>Air China Cargo</w:t>
-            </w:r>
-          </w:p>
-        </w:tc>
-      </w:tr>
-      <w:tr>
-        <w:tc>
-          <w:tcPr>
-            <w:tcW w:type="dxa" w:w="4320"/>
-          </w:tcPr>
-          <w:p>
-            <w:r>
-              <w:t>Origin</w:t>
-            </w:r>
-          </w:p>
-        </w:tc>
-        <w:tc>
-          <w:tcPr>
-            <w:tcW w:type="dxa" w:w="4320"/>
-          </w:tcPr>
-          <w:p>
-            <w:r>
-              <w:t>China</w:t>
-            </w:r>
-          </w:p>
-        </w:tc>
-      </w:tr>
-      <w:tr>
-        <w:tc>
-          <w:tcPr>
-            <w:tcW w:type="dxa" w:w="4320"/>
-          </w:tcPr>
-          <w:p>
-            <w:r>
-              <w:t>Primary cost mode</w:t>
-            </w:r>
-          </w:p>
-        </w:tc>
-        <w:tc>
-          <w:tcPr>
-            <w:tcW w:type="dxa" w:w="4320"/>
-          </w:tcPr>
-          <w:p>
-            <w:r>
-              <w:t>Auto FX</w:t>
+              <w:t>Auto FX (set on create)</w:t>
             </w:r>
           </w:p>
         </w:tc>
@@ -1212,28 +1379,6 @@
           </w:p>
         </w:tc>
       </w:tr>
-      <w:tr>
-        <w:tc>
-          <w:tcPr>
-            <w:tcW w:type="dxa" w:w="4320"/>
-          </w:tcPr>
-          <w:p>
-            <w:r>
-              <w:t>Local currency</w:t>
-            </w:r>
-          </w:p>
-        </w:tc>
-        <w:tc>
-          <w:tcPr>
-            <w:tcW w:type="dxa" w:w="4320"/>
-          </w:tcPr>
-          <w:p>
-            <w:r>
-              <w:t>ZMW</w:t>
-            </w:r>
-          </w:p>
-        </w:tc>
-      </w:tr>
     </w:tbl>
     <w:p/>
     <w:p>
@@ -1241,7 +1386,7 @@
         <w:pStyle w:val="Heading2"/>
       </w:pPr>
       <w:r>
-        <w:t>Lines (mode: Auto FX on each line)</w:t>
+        <w:t>Lines</w:t>
       </w:r>
     </w:p>
     <w:tbl>
@@ -1305,7 +1450,7 @@
               <w:rPr>
                 <w:b/>
               </w:rPr>
-              <w:t>Foreign unit (USD)</w:t>
+              <w:t>USD unit</w:t>
             </w:r>
           </w:p>
         </w:tc>
@@ -1317,7 +1462,7 @@
           </w:tcPr>
           <w:p>
             <w:r>
-              <w:t>LED-9W</w:t>
+              <w:t>EARBUD</w:t>
             </w:r>
           </w:p>
         </w:tc>
@@ -1327,7 +1472,133 @@
           </w:tcPr>
           <w:p>
             <w:r>
-              <w:t>50</w:t>
+              <w:t>40</w:t>
+            </w:r>
+          </w:p>
+        </w:tc>
+        <w:tc>
+          <w:tcPr>
+            <w:tcW w:type="dxa" w:w="2160"/>
+          </w:tcPr>
+          <w:p>
+            <w:r>
+              <w:t>2.0</w:t>
+            </w:r>
+          </w:p>
+        </w:tc>
+        <w:tc>
+          <w:tcPr>
+            <w:tcW w:type="dxa" w:w="2160"/>
+          </w:tcPr>
+          <w:p>
+            <w:r>
+              <w:t>6.00</w:t>
+            </w:r>
+          </w:p>
+        </w:tc>
+      </w:tr>
+      <w:tr>
+        <w:tc>
+          <w:tcPr>
+            <w:tcW w:type="dxa" w:w="2160"/>
+          </w:tcPr>
+          <w:p>
+            <w:r>
+              <w:t>CHARGER</w:t>
+            </w:r>
+          </w:p>
+        </w:tc>
+        <w:tc>
+          <w:tcPr>
+            <w:tcW w:type="dxa" w:w="2160"/>
+          </w:tcPr>
+          <w:p>
+            <w:r>
+              <w:t>30</w:t>
+            </w:r>
+          </w:p>
+        </w:tc>
+        <w:tc>
+          <w:tcPr>
+            <w:tcW w:type="dxa" w:w="2160"/>
+          </w:tcPr>
+          <w:p>
+            <w:r>
+              <w:t>6.0</w:t>
+            </w:r>
+          </w:p>
+        </w:tc>
+        <w:tc>
+          <w:tcPr>
+            <w:tcW w:type="dxa" w:w="2160"/>
+          </w:tcPr>
+          <w:p>
+            <w:r>
+              <w:t>4.00</w:t>
+            </w:r>
+          </w:p>
+        </w:tc>
+      </w:tr>
+      <w:tr>
+        <w:tc>
+          <w:tcPr>
+            <w:tcW w:type="dxa" w:w="2160"/>
+          </w:tcPr>
+          <w:p>
+            <w:r>
+              <w:t>CABLE</w:t>
+            </w:r>
+          </w:p>
+        </w:tc>
+        <w:tc>
+          <w:tcPr>
+            <w:tcW w:type="dxa" w:w="2160"/>
+          </w:tcPr>
+          <w:p>
+            <w:r>
+              <w:t>40</w:t>
+            </w:r>
+          </w:p>
+        </w:tc>
+        <w:tc>
+          <w:tcPr>
+            <w:tcW w:type="dxa" w:w="2160"/>
+          </w:tcPr>
+          <w:p>
+            <w:r>
+              <w:t>2.0</w:t>
+            </w:r>
+          </w:p>
+        </w:tc>
+        <w:tc>
+          <w:tcPr>
+            <w:tcW w:type="dxa" w:w="2160"/>
+          </w:tcPr>
+          <w:p>
+            <w:r>
+              <w:t>1.50</w:t>
+            </w:r>
+          </w:p>
+        </w:tc>
+      </w:tr>
+      <w:tr>
+        <w:tc>
+          <w:tcPr>
+            <w:tcW w:type="dxa" w:w="2160"/>
+          </w:tcPr>
+          <w:p>
+            <w:r>
+              <w:t>CASE-SOFT</w:t>
+            </w:r>
+          </w:p>
+        </w:tc>
+        <w:tc>
+          <w:tcPr>
+            <w:tcW w:type="dxa" w:w="2160"/>
+          </w:tcPr>
+          <w:p>
+            <w:r>
+              <w:t>40</w:t>
             </w:r>
           </w:p>
         </w:tc>
@@ -1347,91 +1618,7 @@
           </w:tcPr>
           <w:p>
             <w:r>
-              <w:t>0.85</w:t>
-            </w:r>
-          </w:p>
-        </w:tc>
-      </w:tr>
-      <w:tr>
-        <w:tc>
-          <w:tcPr>
-            <w:tcW w:type="dxa" w:w="2160"/>
-          </w:tcPr>
-          <w:p>
-            <w:r>
-              <w:t>LED-12W</w:t>
-            </w:r>
-          </w:p>
-        </w:tc>
-        <w:tc>
-          <w:tcPr>
-            <w:tcW w:type="dxa" w:w="2160"/>
-          </w:tcPr>
-          <w:p>
-            <w:r>
-              <w:t>30</w:t>
-            </w:r>
-          </w:p>
-        </w:tc>
-        <w:tc>
-          <w:tcPr>
-            <w:tcW w:type="dxa" w:w="2160"/>
-          </w:tcPr>
-          <w:p>
-            <w:r>
-              <w:t>3.0</w:t>
-            </w:r>
-          </w:p>
-        </w:tc>
-        <w:tc>
-          <w:tcPr>
-            <w:tcW w:type="dxa" w:w="2160"/>
-          </w:tcPr>
-          <w:p>
-            <w:r>
-              <w:t>1.20</w:t>
-            </w:r>
-          </w:p>
-        </w:tc>
-      </w:tr>
-      <w:tr>
-        <w:tc>
-          <w:tcPr>
-            <w:tcW w:type="dxa" w:w="2160"/>
-          </w:tcPr>
-          <w:p>
-            <w:r>
-              <w:t>LED-BATT</w:t>
-            </w:r>
-          </w:p>
-        </w:tc>
-        <w:tc>
-          <w:tcPr>
-            <w:tcW w:type="dxa" w:w="2160"/>
-          </w:tcPr>
-          <w:p>
-            <w:r>
-              <w:t>20</w:t>
-            </w:r>
-          </w:p>
-        </w:tc>
-        <w:tc>
-          <w:tcPr>
-            <w:tcW w:type="dxa" w:w="2160"/>
-          </w:tcPr>
-          <w:p>
-            <w:r>
-              <w:t>9.0</w:t>
-            </w:r>
-          </w:p>
-        </w:tc>
-        <w:tc>
-          <w:tcPr>
-            <w:tcW w:type="dxa" w:w="2160"/>
-          </w:tcPr>
-          <w:p>
-            <w:r>
-              <w:t>2.50</w:t>
+              <w:t>3.00</w:t>
             </w:r>
           </w:p>
         </w:tc>
@@ -1439,11 +1626,16 @@
     </w:tbl>
     <w:p/>
     <w:p>
+      <w:r>
+        <w:t>Total line weight = 14 kg</w:t>
+      </w:r>
+    </w:p>
+    <w:p>
       <w:pPr>
         <w:pStyle w:val="Heading2"/>
       </w:pPr>
       <w:r>
-        <w:t>Save costs</w:t>
+        <w:t>Costs</w:t>
       </w:r>
     </w:p>
     <w:tbl>
@@ -1501,7 +1693,7 @@
           </w:tcPr>
           <w:p>
             <w:r>
-              <w:t>27.40</w:t>
+              <w:t>Fetch FX (or 27.50)</w:t>
             </w:r>
           </w:p>
         </w:tc>
@@ -1513,7 +1705,7 @@
           </w:tcPr>
           <w:p>
             <w:r>
-              <w:t>Shipping total</w:t>
+              <w:t>Shipping</w:t>
             </w:r>
           </w:p>
         </w:tc>
@@ -1523,7 +1715,7 @@
           </w:tcPr>
           <w:p>
             <w:r>
-              <w:t>6,800</w:t>
+              <w:t>2800</w:t>
             </w:r>
           </w:p>
         </w:tc>
@@ -1535,7 +1727,7 @@
           </w:tcPr>
           <w:p>
             <w:r>
-              <w:t>Duty total</w:t>
+              <w:t>Duty</w:t>
             </w:r>
           </w:p>
         </w:tc>
@@ -1545,7 +1737,7 @@
           </w:tcPr>
           <w:p>
             <w:r>
-              <w:t>2,400</w:t>
+              <w:t>700</w:t>
             </w:r>
           </w:p>
         </w:tc>
@@ -1557,7 +1749,7 @@
           </w:tcPr>
           <w:p>
             <w:r>
-              <w:t>VAT total</w:t>
+              <w:t>VAT</w:t>
             </w:r>
           </w:p>
         </w:tc>
@@ -1567,7 +1759,7 @@
           </w:tcPr>
           <w:p>
             <w:r>
-              <w:t>3,200</w:t>
+              <w:t>1050</w:t>
             </w:r>
           </w:p>
         </w:tc>
@@ -1579,7 +1771,7 @@
           </w:tcPr>
           <w:p>
             <w:r>
-              <w:t>Paperwork source</w:t>
+              <w:t>Paperwork</w:t>
             </w:r>
           </w:p>
         </w:tc>
@@ -1589,18 +1781,13 @@
           </w:tcPr>
           <w:p>
             <w:r>
-              <w:t>Supplier inv BP-SZ-11907 / CA slip ZCP-778</w:t>
+              <w:t>CI-220 / clearance CL-55</w:t>
             </w:r>
           </w:p>
         </w:tc>
       </w:tr>
     </w:tbl>
     <w:p/>
-    <w:p>
-      <w:r>
-        <w:t>Note: You can use Fetch FX instead of typing 27.40 if the backend has internet access.</w:t>
-      </w:r>
-    </w:p>
     <w:p>
       <w:pPr>
         <w:pStyle w:val="Heading2"/>
@@ -1664,7 +1851,7 @@
           </w:tcPr>
           <w:p>
             <w:r>
-              <w:t>weight</w:t>
+              <w:t>weight (14 kg)</w:t>
             </w:r>
           </w:p>
         </w:tc>
@@ -1676,7 +1863,7 @@
           </w:tcPr>
           <w:p>
             <w:r>
-              <w:t>Profit margin</w:t>
+              <w:t>Margin</w:t>
             </w:r>
           </w:p>
         </w:tc>
@@ -1686,7 +1873,88 @@
           </w:tcPr>
           <w:p>
             <w:r>
-              <w:t>0.25 (25%)</w:t>
+              <w:t>0.25</w:t>
+            </w:r>
+          </w:p>
+        </w:tc>
+      </w:tr>
+    </w:tbl>
+    <w:p/>
+    <w:p>
+      <w:pPr>
+        <w:pStyle w:val="Heading2"/>
+      </w:pPr>
+      <w:r>
+        <w:t>Expected if rate = 27.50</w:t>
+      </w:r>
+    </w:p>
+    <w:p>
+      <w:r>
+        <w:t>Shares per kg: ship 200 + duty 50 + VAT 75 = 325</w:t>
+      </w:r>
+    </w:p>
+    <w:tbl>
+      <w:tblPr>
+        <w:tblStyle w:val="TableGrid"/>
+        <w:tblW w:type="auto" w:w="0"/>
+        <w:tblLook w:firstColumn="1" w:firstRow="1" w:lastColumn="0" w:lastRow="0" w:noHBand="0" w:noVBand="1" w:val="04A0"/>
+      </w:tblPr>
+      <w:tblGrid>
+        <w:gridCol w:w="2160"/>
+        <w:gridCol w:w="2160"/>
+        <w:gridCol w:w="2160"/>
+        <w:gridCol w:w="2160"/>
+      </w:tblGrid>
+      <w:tr>
+        <w:tc>
+          <w:tcPr>
+            <w:tcW w:type="dxa" w:w="2160"/>
+          </w:tcPr>
+          <w:p>
+            <w:r>
+              <w:rPr>
+                <w:b/>
+              </w:rPr>
+              <w:t>SKU</w:t>
+            </w:r>
+          </w:p>
+        </w:tc>
+        <w:tc>
+          <w:tcPr>
+            <w:tcW w:type="dxa" w:w="2160"/>
+          </w:tcPr>
+          <w:p>
+            <w:r>
+              <w:rPr>
+                <w:b/>
+              </w:rPr>
+              <w:t>Local unit</w:t>
+            </w:r>
+          </w:p>
+        </w:tc>
+        <w:tc>
+          <w:tcPr>
+            <w:tcW w:type="dxa" w:w="2160"/>
+          </w:tcPr>
+          <w:p>
+            <w:r>
+              <w:rPr>
+                <w:b/>
+              </w:rPr>
+              <w:t>Landed unit</w:t>
+            </w:r>
+          </w:p>
+        </w:tc>
+        <w:tc>
+          <w:tcPr>
+            <w:tcW w:type="dxa" w:w="2160"/>
+          </w:tcPr>
+          <w:p>
+            <w:r>
+              <w:rPr>
+                <w:b/>
+              </w:rPr>
+              <w:t>Suggested ×1.25</w:t>
             </w:r>
           </w:p>
         </w:tc>
@@ -1694,21 +1962,167 @@
       <w:tr>
         <w:tc>
           <w:tcPr>
-            <w:tcW w:type="dxa" w:w="4320"/>
+            <w:tcW w:type="dxa" w:w="2160"/>
           </w:tcPr>
           <w:p>
             <w:r>
-              <w:t>Action</w:t>
+              <w:t>EARBUD</w:t>
             </w:r>
           </w:p>
         </w:tc>
         <w:tc>
           <w:tcPr>
-            <w:tcW w:type="dxa" w:w="4320"/>
+            <w:tcW w:type="dxa" w:w="2160"/>
           </w:tcPr>
           <w:p>
             <w:r>
-              <w:t>Commit batch when ready</w:t>
+              <w:t>165.00</w:t>
+            </w:r>
+          </w:p>
+        </w:tc>
+        <w:tc>
+          <w:tcPr>
+            <w:tcW w:type="dxa" w:w="2160"/>
+          </w:tcPr>
+          <w:p>
+            <w:r>
+              <w:t>181.25</w:t>
+            </w:r>
+          </w:p>
+        </w:tc>
+        <w:tc>
+          <w:tcPr>
+            <w:tcW w:type="dxa" w:w="2160"/>
+          </w:tcPr>
+          <w:p>
+            <w:r>
+              <w:t>226.56</w:t>
+            </w:r>
+          </w:p>
+        </w:tc>
+      </w:tr>
+      <w:tr>
+        <w:tc>
+          <w:tcPr>
+            <w:tcW w:type="dxa" w:w="2160"/>
+          </w:tcPr>
+          <w:p>
+            <w:r>
+              <w:t>CHARGER</w:t>
+            </w:r>
+          </w:p>
+        </w:tc>
+        <w:tc>
+          <w:tcPr>
+            <w:tcW w:type="dxa" w:w="2160"/>
+          </w:tcPr>
+          <w:p>
+            <w:r>
+              <w:t>110.00</w:t>
+            </w:r>
+          </w:p>
+        </w:tc>
+        <w:tc>
+          <w:tcPr>
+            <w:tcW w:type="dxa" w:w="2160"/>
+          </w:tcPr>
+          <w:p>
+            <w:r>
+              <w:t>175.00</w:t>
+            </w:r>
+          </w:p>
+        </w:tc>
+        <w:tc>
+          <w:tcPr>
+            <w:tcW w:type="dxa" w:w="2160"/>
+          </w:tcPr>
+          <w:p>
+            <w:r>
+              <w:t>218.75</w:t>
+            </w:r>
+          </w:p>
+        </w:tc>
+      </w:tr>
+      <w:tr>
+        <w:tc>
+          <w:tcPr>
+            <w:tcW w:type="dxa" w:w="2160"/>
+          </w:tcPr>
+          <w:p>
+            <w:r>
+              <w:t>CABLE</w:t>
+            </w:r>
+          </w:p>
+        </w:tc>
+        <w:tc>
+          <w:tcPr>
+            <w:tcW w:type="dxa" w:w="2160"/>
+          </w:tcPr>
+          <w:p>
+            <w:r>
+              <w:t>41.25</w:t>
+            </w:r>
+          </w:p>
+        </w:tc>
+        <w:tc>
+          <w:tcPr>
+            <w:tcW w:type="dxa" w:w="2160"/>
+          </w:tcPr>
+          <w:p>
+            <w:r>
+              <w:t>57.50</w:t>
+            </w:r>
+          </w:p>
+        </w:tc>
+        <w:tc>
+          <w:tcPr>
+            <w:tcW w:type="dxa" w:w="2160"/>
+          </w:tcPr>
+          <w:p>
+            <w:r>
+              <w:t>71.88</w:t>
+            </w:r>
+          </w:p>
+        </w:tc>
+      </w:tr>
+      <w:tr>
+        <w:tc>
+          <w:tcPr>
+            <w:tcW w:type="dxa" w:w="2160"/>
+          </w:tcPr>
+          <w:p>
+            <w:r>
+              <w:t>CASE-SOFT</w:t>
+            </w:r>
+          </w:p>
+        </w:tc>
+        <w:tc>
+          <w:tcPr>
+            <w:tcW w:type="dxa" w:w="2160"/>
+          </w:tcPr>
+          <w:p>
+            <w:r>
+              <w:t>82.50</w:t>
+            </w:r>
+          </w:p>
+        </w:tc>
+        <w:tc>
+          <w:tcPr>
+            <w:tcW w:type="dxa" w:w="2160"/>
+          </w:tcPr>
+          <w:p>
+            <w:r>
+              <w:t>115.00</w:t>
+            </w:r>
+          </w:p>
+        </w:tc>
+        <w:tc>
+          <w:tcPr>
+            <w:tcW w:type="dxa" w:w="2160"/>
+          </w:tcPr>
+          <w:p>
+            <w:r>
+              <w:t>143.75</w:t>
             </w:r>
           </w:p>
         </w:tc>
@@ -1720,31 +2134,35 @@
         <w:pStyle w:val="Heading1"/>
       </w:pPr>
       <w:r>
-        <w:t>Quick order of work</w:t>
+        <w:t>Order of work</w:t>
       </w:r>
     </w:p>
     <w:p>
       <w:r>
-        <w:t>1. Products — add all six SKUs listed above.</w:t>
+        <w:t>1. Products → Import CSV (docs/scenarios/samples/products_demo.csv).</w:t>
       </w:r>
     </w:p>
     <w:p>
       <w:r>
-        <w:t>2. Shipments — create SHP-LOC-2026-01, add lines, save costs, Open True Cost, allocate, price, commit.</w:t>
+        <w:t>2. Shipments → Clear drafts if needed → Import shipment CSV (shipment_A_full.csv) → True Cost → quantity → commit.</w:t>
       </w:r>
     </w:p>
     <w:p>
       <w:r>
-        <w:t>3. Repeat for SHP-FX-2026-02 with USD lines and exchange rate.</w:t>
+        <w:t>3. Shipments → Import shipment CSV (shipment_B_full.csv) → Fetch FX if you want a live rate (or keep 27.50) → True Cost → weight → commit.</w:t>
       </w:r>
     </w:p>
-    <w:p/>
+    <w:p>
+      <w:r>
+        <w:t>4. Open a committed shipment → Cost history (When / What).</w:t>
+      </w:r>
+    </w:p>
     <w:p>
       <w:r>
         <w:rPr>
           <w:sz w:val="20"/>
         </w:rPr>
-        <w:t>Generated for Tranz-Algo local demo and viva practice.</w:t>
+        <w:t>Full shipment CSV = field,value meta rows, then a sku line table. Samples: docs/scenarios/samples/.</w:t>
       </w:r>
     </w:p>
     <w:sectPr>

</xml_diff>